<commit_message>
Point the site at Virtus and eolas.nz, and archive the R essays.
The company name links to virtus-solutions.io. The product link is
eolas.nz. The S3 and Plumber pieces from the old company blog are in
the writing archive, and the CV download matches.
</commit_message>
<xml_diff>
--- a/cv/phil-donovan-cv.docx
+++ b/cv/phil-donovan-cv.docx
@@ -10,8 +10,8 @@
         <w:t xml:space="preserve">Phil Donovan — Curriculum Vitae</w:t>
       </w:r>
     </w:p>
-    <w:bookmarkStart w:id="60" w:name="main"/>
-    <w:bookmarkStart w:id="21" w:name="phil-donovan"/>
+    <w:bookmarkStart w:id="63" w:name="main"/>
+    <w:bookmarkStart w:id="22" w:name="phil-donovan"/>
     <w:p>
       <w:pPr>
         <w:pStyle w:val="Heading1"/>
@@ -33,15 +33,7 @@
         <w:pStyle w:val="BodyText"/>
       </w:pPr>
       <w:r>
-        <w:t xml:space="preserve">Director — Virtus Solutions</w:t>
-      </w:r>
-    </w:p>
-    <w:p>
-      <w:pPr>
-        <w:pStyle w:val="BodyText"/>
-      </w:pPr>
-      <w:r>
-        <w:t xml:space="preserve">Products —</w:t>
+        <w:t xml:space="preserve">Director —</w:t>
       </w:r>
       <w:r>
         <w:t xml:space="preserve"> </w:t>
@@ -51,7 +43,7 @@
           <w:rPr>
             <w:rStyle w:val="Hyperlink"/>
           </w:rPr>
-          <w:t xml:space="preserve">eolas.fyi</w:t>
+          <w:t xml:space="preserve">Virtus Solutions</w:t>
         </w:r>
       </w:hyperlink>
     </w:p>
@@ -60,6 +52,25 @@
         <w:pStyle w:val="BodyText"/>
       </w:pPr>
       <w:r>
+        <w:t xml:space="preserve">Products —</w:t>
+      </w:r>
+      <w:r>
+        <w:t xml:space="preserve"> </w:t>
+      </w:r>
+      <w:hyperlink r:id="rId21">
+        <w:r>
+          <w:rPr>
+            <w:rStyle w:val="Hyperlink"/>
+          </w:rPr>
+          <w:t xml:space="preserve">eolas.nz</w:t>
+        </w:r>
+      </w:hyperlink>
+    </w:p>
+    <w:p>
+      <w:pPr>
+        <w:pStyle w:val="BodyText"/>
+      </w:pPr>
+      <w:r>
         <w:t xml:space="preserve">I design data platforms — Snowflake, dbt, Iceberg, AWS — and the models that run</w:t>
       </w:r>
       <w:r>
@@ -95,9 +106,9 @@
         <w:t xml:space="preserve"> ·  Auckland, New Zealand</w:t>
       </w:r>
     </w:p>
-    <w:bookmarkEnd w:id="21"/>
-    <w:bookmarkStart w:id="31" w:name="experience"/>
-    <w:bookmarkStart w:id="22" w:name="experience"/>
+    <w:bookmarkEnd w:id="22"/>
+    <w:bookmarkStart w:id="32" w:name="experience"/>
+    <w:bookmarkStart w:id="23" w:name="experience"/>
     <w:p>
       <w:pPr>
         <w:pStyle w:val="Heading2"/>
@@ -114,8 +125,8 @@
         <w:t xml:space="preserve">2013 — present</w:t>
       </w:r>
     </w:p>
-    <w:bookmarkEnd w:id="22"/>
-    <w:bookmarkStart w:id="23" w:name="Xbf3085596d50d533f14e0ef75d35a201b180a4d"/>
+    <w:bookmarkEnd w:id="23"/>
+    <w:bookmarkStart w:id="24" w:name="Xbf3085596d50d533f14e0ef75d35a201b180a4d"/>
     <w:p>
       <w:pPr>
         <w:pStyle w:val="Heading3"/>
@@ -172,8 +183,8 @@
         <w:t xml:space="preserve">Introduced and rolled out AI-assisted development tooling across the engineering team, setting the standards and workflows for its use.</w:t>
       </w:r>
     </w:p>
-    <w:bookmarkEnd w:id="23"/>
-    <w:bookmarkStart w:id="24" w:name="associate"/>
+    <w:bookmarkEnd w:id="24"/>
+    <w:bookmarkStart w:id="25" w:name="associate"/>
     <w:p>
       <w:pPr>
         <w:pStyle w:val="Heading3"/>
@@ -230,8 +241,8 @@
         <w:t xml:space="preserve">Engineering on the Cost Intelligence Platform.</w:t>
       </w:r>
     </w:p>
-    <w:bookmarkEnd w:id="24"/>
-    <w:bookmarkStart w:id="25" w:name="rsql-developer-engineer-scientist"/>
+    <w:bookmarkEnd w:id="25"/>
+    <w:bookmarkStart w:id="26" w:name="rsql-developer-engineer-scientist"/>
     <w:p>
       <w:pPr>
         <w:pStyle w:val="Heading3"/>
@@ -300,8 +311,8 @@
         <w:t xml:space="preserve">, an R package joining Redshift and other sources to the pricing emulator for reproducible pricing simulation.</w:t>
       </w:r>
     </w:p>
-    <w:bookmarkEnd w:id="25"/>
-    <w:bookmarkStart w:id="26" w:name="senior-analyst-r-developer-sql-engineer"/>
+    <w:bookmarkEnd w:id="26"/>
+    <w:bookmarkStart w:id="27" w:name="senior-analyst-r-developer-sql-engineer"/>
     <w:p>
       <w:pPr>
         <w:pStyle w:val="Heading3"/>
@@ -386,8 +397,8 @@
         <w:t xml:space="preserve">Introduced Quarto-based automated reporting and Shiny dashboards for spatial health trends.</w:t>
       </w:r>
     </w:p>
-    <w:bookmarkEnd w:id="26"/>
-    <w:bookmarkStart w:id="27" w:name="principal-gis-analyst"/>
+    <w:bookmarkEnd w:id="27"/>
+    <w:bookmarkStart w:id="28" w:name="principal-gis-analyst"/>
     <w:p>
       <w:pPr>
         <w:pStyle w:val="Heading3"/>
@@ -474,8 +485,8 @@
         <w:t xml:space="preserve">Wrote monitoring scripts tracking portal credit and cloud spend, cutting resource overruns by around 30%.</w:t>
       </w:r>
     </w:p>
-    <w:bookmarkEnd w:id="27"/>
-    <w:bookmarkStart w:id="28" w:name="spatial-data-scientist"/>
+    <w:bookmarkEnd w:id="28"/>
+    <w:bookmarkStart w:id="29" w:name="spatial-data-scientist"/>
     <w:p>
       <w:pPr>
         <w:pStyle w:val="Heading3"/>
@@ -520,8 +531,8 @@
         <w:t xml:space="preserve">Built 3D air pollution models for Seoul using the ArcGIS JavaScript API.</w:t>
       </w:r>
     </w:p>
-    <w:bookmarkEnd w:id="28"/>
-    <w:bookmarkStart w:id="29" w:name="spatial-economic-data-analyst"/>
+    <w:bookmarkEnd w:id="29"/>
+    <w:bookmarkStart w:id="30" w:name="spatial-economic-data-analyst"/>
     <w:p>
       <w:pPr>
         <w:pStyle w:val="Heading3"/>
@@ -578,8 +589,8 @@
         <w:t xml:space="preserve">Public transport modelling against the Auckland and Wellington transport models.</w:t>
       </w:r>
     </w:p>
-    <w:bookmarkEnd w:id="29"/>
-    <w:bookmarkStart w:id="30" w:name="spatial-data-analyst"/>
+    <w:bookmarkEnd w:id="30"/>
+    <w:bookmarkStart w:id="31" w:name="spatial-data-analyst"/>
     <w:p>
       <w:pPr>
         <w:pStyle w:val="Heading3"/>
@@ -624,10 +635,10 @@
         <w:t xml:space="preserve">Co-authored five peer-reviewed papers on children's mobility and the built environment.</w:t>
       </w:r>
     </w:p>
-    <w:bookmarkEnd w:id="30"/>
     <w:bookmarkEnd w:id="31"/>
+    <w:bookmarkEnd w:id="32"/>
+    <w:bookmarkStart w:id="34" w:name="capabilities"/>
     <w:bookmarkStart w:id="33" w:name="capabilities"/>
-    <w:bookmarkStart w:id="32" w:name="capabilities"/>
     <w:p>
       <w:pPr>
         <w:pStyle w:val="Heading2"/>
@@ -644,7 +655,7 @@
         <w:t xml:space="preserve">Tooling</w:t>
       </w:r>
     </w:p>
-    <w:bookmarkEnd w:id="32"/>
+    <w:bookmarkEnd w:id="33"/>
     <w:p>
       <w:pPr>
         <w:pStyle w:val="DefinitionTerm"/>
@@ -757,9 +768,9 @@
         <w:t xml:space="preserve">R Shiny · Quarto · Power BI · ArcGIS Portal</w:t>
       </w:r>
     </w:p>
-    <w:bookmarkEnd w:id="33"/>
-    <w:bookmarkStart w:id="46" w:name="work"/>
-    <w:bookmarkStart w:id="34" w:name="selected-work"/>
+    <w:bookmarkEnd w:id="34"/>
+    <w:bookmarkStart w:id="47" w:name="work"/>
+    <w:bookmarkStart w:id="35" w:name="selected-work"/>
     <w:p>
       <w:pPr>
         <w:pStyle w:val="Heading2"/>
@@ -776,7 +787,7 @@
         <w:t xml:space="preserve">Open source &amp; projects</w:t>
       </w:r>
     </w:p>
-    <w:bookmarkEnd w:id="34"/>
+    <w:bookmarkEnd w:id="35"/>
     <w:p>
       <w:pPr>
         <w:pStyle w:val="BodyText"/>
@@ -785,12 +796,12 @@
         <w:t xml:space="preserve">Building now</w:t>
       </w:r>
     </w:p>
-    <w:bookmarkStart w:id="37" w:name="eolas"/>
+    <w:bookmarkStart w:id="38" w:name="eolas"/>
     <w:p>
       <w:pPr>
         <w:pStyle w:val="Heading3"/>
       </w:pPr>
-      <w:hyperlink r:id="rId20">
+      <w:hyperlink r:id="rId21">
         <w:r>
           <w:rPr>
             <w:rStyle w:val="Hyperlink"/>
@@ -847,7 +858,7 @@
       <w:r>
         <w:t xml:space="preserve"> </w:t>
       </w:r>
-      <w:hyperlink r:id="rId35">
+      <w:hyperlink r:id="rId36">
         <w:r>
           <w:rPr>
             <w:rStyle w:val="Hyperlink"/>
@@ -864,7 +875,7 @@
       <w:r>
         <w:t xml:space="preserve"> </w:t>
       </w:r>
-      <w:hyperlink r:id="rId36">
+      <w:hyperlink r:id="rId37">
         <w:r>
           <w:rPr>
             <w:rStyle w:val="Hyperlink"/>
@@ -893,13 +904,13 @@
         <w:t xml:space="preserve">Python · R · Singer · Meltano · Iceberg · FastAPI · Snowflake · AWS</w:t>
       </w:r>
     </w:p>
-    <w:bookmarkEnd w:id="37"/>
-    <w:bookmarkStart w:id="39" w:name="nzcensr"/>
+    <w:bookmarkEnd w:id="38"/>
+    <w:bookmarkStart w:id="40" w:name="nzcensr"/>
     <w:p>
       <w:pPr>
         <w:pStyle w:val="Heading3"/>
       </w:pPr>
-      <w:hyperlink r:id="rId38">
+      <w:hyperlink r:id="rId39">
         <w:r>
           <w:rPr>
             <w:rStyle w:val="Hyperlink"/>
@@ -924,13 +935,13 @@
         <w:t xml:space="preserve">R · Spatial</w:t>
       </w:r>
     </w:p>
-    <w:bookmarkEnd w:id="39"/>
-    <w:bookmarkStart w:id="41" w:name="nz-economic-overview"/>
+    <w:bookmarkEnd w:id="40"/>
+    <w:bookmarkStart w:id="42" w:name="nz-economic-overview"/>
     <w:p>
       <w:pPr>
         <w:pStyle w:val="Heading3"/>
       </w:pPr>
-      <w:hyperlink r:id="rId40">
+      <w:hyperlink r:id="rId41">
         <w:r>
           <w:rPr>
             <w:rStyle w:val="Hyperlink"/>
@@ -955,13 +966,13 @@
         <w:t xml:space="preserve">R · Shiny</w:t>
       </w:r>
     </w:p>
-    <w:bookmarkEnd w:id="41"/>
-    <w:bookmarkStart w:id="43" w:name="nps-udc"/>
+    <w:bookmarkEnd w:id="42"/>
+    <w:bookmarkStart w:id="44" w:name="nps-udc"/>
     <w:p>
       <w:pPr>
         <w:pStyle w:val="Heading3"/>
       </w:pPr>
-      <w:hyperlink r:id="rId42">
+      <w:hyperlink r:id="rId43">
         <w:r>
           <w:rPr>
             <w:rStyle w:val="Hyperlink"/>
@@ -986,8 +997,8 @@
         <w:t xml:space="preserve">Economics · Spatial regression</w:t>
       </w:r>
     </w:p>
-    <w:bookmarkEnd w:id="43"/>
-    <w:bookmarkStart w:id="44" w:name="ndai-c"/>
+    <w:bookmarkEnd w:id="44"/>
+    <w:bookmarkStart w:id="45" w:name="ndai-c"/>
     <w:p>
       <w:pPr>
         <w:pStyle w:val="Heading3"/>
@@ -1012,8 +1023,8 @@
         <w:t xml:space="preserve">Accessibility · Network analysis</w:t>
       </w:r>
     </w:p>
-    <w:bookmarkEnd w:id="44"/>
-    <w:bookmarkStart w:id="45" w:name="nphsintel"/>
+    <w:bookmarkEnd w:id="45"/>
+    <w:bookmarkStart w:id="46" w:name="nphsintel"/>
     <w:p>
       <w:pPr>
         <w:pStyle w:val="Heading3"/>
@@ -1038,10 +1049,10 @@
         <w:t xml:space="preserve">R · Snowflake · PostGIS</w:t>
       </w:r>
     </w:p>
-    <w:bookmarkEnd w:id="45"/>
     <w:bookmarkEnd w:id="46"/>
-    <w:bookmarkStart w:id="53" w:name="writing"/>
-    <w:bookmarkStart w:id="47" w:name="writing"/>
+    <w:bookmarkEnd w:id="47"/>
+    <w:bookmarkStart w:id="56" w:name="writing"/>
+    <w:bookmarkStart w:id="48" w:name="writing"/>
     <w:p>
       <w:pPr>
         <w:pStyle w:val="Heading2"/>
@@ -1058,7 +1069,7 @@
         <w:t xml:space="preserve">2023 — 2026</w:t>
       </w:r>
     </w:p>
-    <w:bookmarkEnd w:id="47"/>
+    <w:bookmarkEnd w:id="48"/>
     <w:p>
       <w:pPr>
         <w:numPr>
@@ -1076,7 +1087,7 @@
       <w:r>
         <w:t xml:space="preserve"> </w:t>
       </w:r>
-      <w:hyperlink r:id="rId48">
+      <w:hyperlink r:id="rId49">
         <w:r>
           <w:rPr>
             <w:rStyle w:val="Hyperlink"/>
@@ -1103,6 +1114,76 @@
         <w:pStyle w:val="Compact"/>
       </w:pPr>
       <w:r>
+        <w:t xml:space="preserve">24 December 2025</w:t>
+      </w:r>
+      <w:r>
+        <w:t xml:space="preserve"> </w:t>
+      </w:r>
+      <w:r>
+        <w:t xml:space="preserve"> </w:t>
+      </w:r>
+      <w:hyperlink r:id="rId50">
+        <w:r>
+          <w:rPr>
+            <w:rStyle w:val="Hyperlink"/>
+          </w:rPr>
+          <w:t xml:space="preserve">The quiet power of S3</w:t>
+        </w:r>
+      </w:hyperlink>
+      <w:r>
+        <w:t xml:space="preserve"> </w:t>
+      </w:r>
+      <w:r>
+        <w:t xml:space="preserve">Vaccine-specific summaries from one event table, using R's smallest object system.</w:t>
+      </w:r>
+      <w:r>
+        <w:t xml:space="preserve"> </w:t>
+      </w:r>
+    </w:p>
+    <w:p>
+      <w:pPr>
+        <w:numPr>
+          <w:ilvl w:val="0"/>
+          <w:numId w:val="1009"/>
+        </w:numPr>
+        <w:pStyle w:val="Compact"/>
+      </w:pPr>
+      <w:r>
+        <w:t xml:space="preserve">24 December 2025</w:t>
+      </w:r>
+      <w:r>
+        <w:t xml:space="preserve"> </w:t>
+      </w:r>
+      <w:r>
+        <w:t xml:space="preserve"> </w:t>
+      </w:r>
+      <w:hyperlink r:id="rId51">
+        <w:r>
+          <w:rPr>
+            <w:rStyle w:val="Hyperlink"/>
+          </w:rPr>
+          <w:t xml:space="preserve">Serving R charts with Plumber and HTMX</w:t>
+        </w:r>
+      </w:hyperlink>
+      <w:r>
+        <w:t xml:space="preserve"> </w:t>
+      </w:r>
+      <w:r>
+        <w:t xml:space="preserve">A Highcharts figure drawn in R, returned as HTML, and swapped into the page.</w:t>
+      </w:r>
+      <w:r>
+        <w:t xml:space="preserve"> </w:t>
+      </w:r>
+    </w:p>
+    <w:p>
+      <w:pPr>
+        <w:numPr>
+          <w:ilvl w:val="0"/>
+          <w:numId w:val="1009"/>
+        </w:numPr>
+        <w:pStyle w:val="Compact"/>
+      </w:pPr>
+      <w:r>
         <w:t xml:space="preserve">16 May 2024</w:t>
       </w:r>
       <w:r>
@@ -1111,7 +1192,7 @@
       <w:r>
         <w:t xml:space="preserve"> </w:t>
       </w:r>
-      <w:hyperlink r:id="rId49">
+      <w:hyperlink r:id="rId52">
         <w:r>
           <w:rPr>
             <w:rStyle w:val="Hyperlink"/>
@@ -1170,7 +1251,7 @@
       <w:r>
         <w:t xml:space="preserve"> </w:t>
       </w:r>
-      <w:hyperlink r:id="rId50">
+      <w:hyperlink r:id="rId53">
         <w:r>
           <w:rPr>
             <w:rStyle w:val="Hyperlink"/>
@@ -1205,7 +1286,7 @@
       <w:r>
         <w:t xml:space="preserve"> </w:t>
       </w:r>
-      <w:hyperlink r:id="rId51">
+      <w:hyperlink r:id="rId54">
         <w:r>
           <w:rPr>
             <w:rStyle w:val="Hyperlink"/>
@@ -1240,7 +1321,7 @@
       <w:r>
         <w:t xml:space="preserve"> </w:t>
       </w:r>
-      <w:hyperlink r:id="rId52">
+      <w:hyperlink r:id="rId55">
         <w:r>
           <w:rPr>
             <w:rStyle w:val="Hyperlink"/>
@@ -1258,9 +1339,9 @@
         <w:t xml:space="preserve"> </w:t>
       </w:r>
     </w:p>
-    <w:bookmarkEnd w:id="53"/>
-    <w:bookmarkStart w:id="55" w:name="education"/>
-    <w:bookmarkStart w:id="54" w:name="education"/>
+    <w:bookmarkEnd w:id="56"/>
+    <w:bookmarkStart w:id="58" w:name="education"/>
+    <w:bookmarkStart w:id="57" w:name="education"/>
     <w:p>
       <w:pPr>
         <w:pStyle w:val="Heading2"/>
@@ -1277,7 +1358,7 @@
         <w:t xml:space="preserve">2007 — 2013</w:t>
       </w:r>
     </w:p>
-    <w:bookmarkEnd w:id="54"/>
+    <w:bookmarkEnd w:id="57"/>
     <w:p>
       <w:pPr>
         <w:numPr>
@@ -1314,9 +1395,9 @@
         <w:t xml:space="preserve">2007 — 2010 · BSc in Geography and Geology · Victoria University of Wellington</w:t>
       </w:r>
     </w:p>
-    <w:bookmarkEnd w:id="55"/>
-    <w:bookmarkStart w:id="57" w:name="research"/>
-    <w:bookmarkStart w:id="56" w:name="published-research"/>
+    <w:bookmarkEnd w:id="58"/>
+    <w:bookmarkStart w:id="60" w:name="research"/>
+    <w:bookmarkStart w:id="59" w:name="published-research"/>
     <w:p>
       <w:pPr>
         <w:pStyle w:val="Heading2"/>
@@ -1333,7 +1414,7 @@
         <w:t xml:space="preserve">Co-authored</w:t>
       </w:r>
     </w:p>
-    <w:bookmarkEnd w:id="56"/>
+    <w:bookmarkEnd w:id="59"/>
     <w:p>
       <w:pPr>
         <w:numPr>
@@ -1394,9 +1475,9 @@
         <w:t xml:space="preserve">Development of a systems model to visualise the complexity of children's independent mobility — Badland, Kearns, Carroll, Oliver, Mavoa, Donovan, Parker, Chaudhury, Lin &amp; Witten</w:t>
       </w:r>
     </w:p>
-    <w:bookmarkEnd w:id="57"/>
-    <w:bookmarkStart w:id="59" w:name="contact"/>
-    <w:bookmarkStart w:id="58" w:name="get-in-touch"/>
+    <w:bookmarkEnd w:id="60"/>
+    <w:bookmarkStart w:id="62" w:name="contact"/>
+    <w:bookmarkStart w:id="61" w:name="get-in-touch"/>
     <w:p>
       <w:pPr>
         <w:pStyle w:val="Heading2"/>
@@ -1413,7 +1494,7 @@
         <w:t xml:space="preserve">Auckland · NZST</w:t>
       </w:r>
     </w:p>
-    <w:bookmarkEnd w:id="58"/>
+    <w:bookmarkEnd w:id="61"/>
     <w:p>
       <w:pPr>
         <w:pStyle w:val="BodyText"/>
@@ -1476,8 +1557,8 @@
         <w:t xml:space="preserve">R-universe: phildonovan.r-universe.dev</w:t>
       </w:r>
     </w:p>
-    <w:bookmarkEnd w:id="59"/>
-    <w:bookmarkEnd w:id="60"/>
+    <w:bookmarkEnd w:id="62"/>
+    <w:bookmarkEnd w:id="63"/>
     <w:sectPr/>
   </w:body>
 </w:document>
@@ -1509,7 +1590,7 @@
 <file path=word/numbering.xml><?xml version="1.0" encoding="utf-8"?>
 <w:numbering xmlns:w="http://schemas.openxmlformats.org/wordprocessingml/2006/main">
   <w:abstractNum w:abstractNumId="990">
-    <w:nsid w:val="A990"/>
+    <w:nsid w:val="2c1ae401"/>
     <w:multiLevelType w:val="multilevel"/>
     <w:lvl w:ilvl="0">
       <w:numFmt w:val="bullet"/>
@@ -1585,7 +1666,7 @@
     </w:lvl>
   </w:abstractNum>
   <w:abstractNum w:abstractNumId="991">
-    <w:nsid w:val="A991"/>
+    <w:nsid w:val="ea454b4c"/>
     <w:multiLevelType w:val="multilevel"/>
     <w:lvl w:ilvl="0">
       <w:numFmt w:val="bullet"/>
@@ -1661,7 +1742,7 @@
     </w:lvl>
   </w:abstractNum>
   <w:abstractNum w:abstractNumId="99201">
-    <w:nsid w:val="A99201"/>
+    <w:nsid w:val="71315dca"/>
     <w:multiLevelType w:val="multilevel"/>
     <w:lvl w:ilvl="0">
       <w:start w:val="1"/>
@@ -1915,25 +1996,6 @@
       <w:jc w:val="center"/>
     </w:pPr>
   </w:style>
-  <w:style w:customStyle="1" w:styleId="AbstractTitle" w:type="paragraph">
-    <w:name w:val="Abstract Title"/>
-    <w:basedOn w:val="Normal"/>
-    <w:next w:val="Abstract"/>
-    <w:qFormat/>
-    <w:pPr>
-      <w:keepNext/>
-      <w:keepLines/>
-      <w:jc w:val="center"/>
-      <w:spacing w:after="0" w:before="300"/>
-    </w:pPr>
-    <w:rPr>
-      <w:sz w:val="20"/>
-      <w:szCs w:val="20"/>
-      <w:b/>
-      <w:color w:val="345A8A"/>
-      &gt;
-    </w:rPr>
-  </w:style>
   <w:style w:customStyle="1" w:styleId="Abstract" w:type="paragraph">
     <w:name w:val="Abstract"/>
     <w:basedOn w:val="Normal"/>
@@ -1942,7 +2004,7 @@
     <w:pPr>
       <w:keepNext/>
       <w:keepLines/>
-      <w:spacing w:after="300" w:before="100"/>
+      <w:spacing w:after="300" w:before="300"/>
     </w:pPr>
     <w:rPr>
       <w:sz w:val="20"/>
@@ -2389,10 +2451,7 @@
   <w:style w:type="character" w:customStyle="1" w:styleId="ImportTok">
     <w:name w:val="ImportTok"/>
     <w:basedOn w:val="VerbatimChar"/>
-    <w:rPr>
-      <w:color w:val="008000"/>
-      <w:b/>
-    </w:rPr>
+    <w:rPr/>
   </w:style>
   <w:style w:type="character" w:customStyle="1" w:styleId="CommentTok">
     <w:name w:val="CommentTok"/>
@@ -2467,9 +2526,7 @@
   <w:style w:type="character" w:customStyle="1" w:styleId="BuiltInTok">
     <w:name w:val="BuiltInTok"/>
     <w:basedOn w:val="VerbatimChar"/>
-    <w:rPr>
-      <w:color w:val="008000"/>
-    </w:rPr>
+    <w:rPr/>
   </w:style>
   <w:style w:type="character" w:customStyle="1" w:styleId="ExtensionTok">
     <w:name w:val="ExtensionTok"/>

</xml_diff>